<commit_message>
Editie 6: img-tags uit DOCX-conversie verwijderd, downloads bijgewerkt
</commit_message>
<xml_diff>
--- a/assets/downloads-editie-6/editie6_aflevering-01-zes-ordes-van-fasering.docx
+++ b/assets/downloads-editie-6/editie6_aflevering-01-zes-ordes-van-fasering.docx
@@ -50,11 +50,6 @@
         </w:rPr>
         <w:t xml:space="preserve">Tijdlijn 2026 tot 2036</w:t>
       </w:r>
-    </w:p>
-    <w:p>
-      <w:pPr>
-        <w:pStyle w:val="BodyText"/>
-      </w:pPr>
     </w:p>
     <w:p>
       <w:pPr>

</xml_diff>

<commit_message>
Editie 6: 12 nieuwe charts (T1/P3/D3/P6/D4/P4/T3/D5/D2) + transitiehandleiding + Pareto-werkmodel als downloads
</commit_message>
<xml_diff>
--- a/assets/downloads-editie-6/editie6_aflevering-01-zes-ordes-van-fasering.docx
+++ b/assets/downloads-editie-6/editie6_aflevering-01-zes-ordes-van-fasering.docx
@@ -49,6 +49,14 @@
           <w:bCs/>
         </w:rPr>
         <w:t xml:space="preserve">Tijdlijn 2026 tot 2036</w:t>
+      </w:r>
+    </w:p>
+    <w:p>
+      <w:pPr>
+        <w:pStyle w:val="BodyText"/>
+      </w:pPr>
+      <w:r>
+        <w:t xml:space="preserve">De fasering raakt drie bestuurslagen tegelijk — Rijk, provincie, gemeente — elk met een eigen meting en een eigen tempo. De kwaliteitskaart hieronder toont waar elke laag staat op de zes fases, en waar de gaten zitten die in dit draaiboek worden gedicht.</w:t>
       </w:r>
     </w:p>
     <w:p>

</xml_diff>